<commit_message>
Fixing the pv generation process
</commit_message>
<xml_diff>
--- a/src/main/resources/templates/pv_template.docx
+++ b/src/main/resources/templates/pv_template.docx
@@ -669,7 +669,8 @@
     <w:tbl>
       <w:tblPr>
         <w:tblStyle w:val="TableGrid"/>
-        <w:tblW w:w="0" w:type="auto"/>
+        <w:tblW w:w="11425" w:type="dxa"/>
+        <w:tblInd w:w="-1260" w:type="dxa"/>
         <w:tblBorders>
           <w:top w:val="none" w:sz="0" w:space="0" w:color="auto"/>
           <w:left w:val="none" w:sz="0" w:space="0" w:color="auto"/>
@@ -681,13 +682,13 @@
         <w:tblLook w:val="04A0" w:firstRow="1" w:lastRow="0" w:firstColumn="1" w:lastColumn="0" w:noHBand="0" w:noVBand="1"/>
       </w:tblPr>
       <w:tblGrid>
-        <w:gridCol w:w="4531"/>
-        <w:gridCol w:w="4531"/>
+        <w:gridCol w:w="5791"/>
+        <w:gridCol w:w="5634"/>
       </w:tblGrid>
       <w:tr>
         <w:tc>
           <w:tcPr>
-            <w:tcW w:w="4531" w:type="dxa"/>
+            <w:tcW w:w="5791" w:type="dxa"/>
           </w:tcPr>
           <w:p>
             <w:pPr>
@@ -713,12 +714,13 @@
         </w:tc>
         <w:tc>
           <w:tcPr>
-            <w:tcW w:w="4531" w:type="dxa"/>
+            <w:tcW w:w="5634" w:type="dxa"/>
           </w:tcPr>
           <w:p>
             <w:pPr>
               <w:pStyle w:val="BodyText3"/>
               <w:spacing w:after="120"/>
+              <w:jc w:val="right"/>
               <w:rPr>
                 <w:sz w:val="24"/>
                 <w:szCs w:val="24"/>
@@ -729,7 +731,21 @@
                 <w:sz w:val="24"/>
                 <w:szCs w:val="24"/>
               </w:rPr>
-              <w:t xml:space="preserve">                                                      </w:t>
+              <w:t xml:space="preserve">                                                    </w:t>
+            </w:r>
+            <w:r>
+              <w:rPr>
+                <w:sz w:val="24"/>
+                <w:szCs w:val="24"/>
+              </w:rPr>
+              <w:t xml:space="preserve"> </w:t>
+            </w:r>
+            <w:r>
+              <w:rPr>
+                <w:sz w:val="24"/>
+                <w:szCs w:val="24"/>
+              </w:rPr>
+              <w:t xml:space="preserve"> </w:t>
             </w:r>
             <w:r>
               <w:rPr>
@@ -744,7 +760,7 @@
       <w:tr>
         <w:tc>
           <w:tcPr>
-            <w:tcW w:w="4531" w:type="dxa"/>
+            <w:tcW w:w="5791" w:type="dxa"/>
           </w:tcPr>
           <w:p>
             <w:pPr>
@@ -770,7 +786,7 @@
         </w:tc>
         <w:tc>
           <w:tcPr>
-            <w:tcW w:w="4531" w:type="dxa"/>
+            <w:tcW w:w="5634" w:type="dxa"/>
           </w:tcPr>
           <w:p>
             <w:pPr>
@@ -795,7 +811,7 @@
       <w:tr>
         <w:tc>
           <w:tcPr>
-            <w:tcW w:w="4531" w:type="dxa"/>
+            <w:tcW w:w="5791" w:type="dxa"/>
           </w:tcPr>
           <w:p>
             <w:pPr>
@@ -821,7 +837,7 @@
         </w:tc>
         <w:tc>
           <w:tcPr>
-            <w:tcW w:w="4531" w:type="dxa"/>
+            <w:tcW w:w="5634" w:type="dxa"/>
           </w:tcPr>
           <w:p>
             <w:pPr>
@@ -1026,17 +1042,6 @@
         </w:rPr>
         <w:t xml:space="preserve">=  </w:t>
       </w:r>
-    </w:p>
-    <w:p>
-      <w:pPr>
-        <w:ind w:firstLine="708"/>
-        <w:rPr>
-          <w:b/>
-          <w:bCs/>
-          <w:sz w:val="24"/>
-          <w:szCs w:val="24"/>
-        </w:rPr>
-      </w:pPr>
     </w:p>
     <w:p>
       <w:pPr>

</xml_diff>